<commit_message>
Hebrews: full meaning audit 2026-09-23 — 17 text fixes (EN 16, KO 1), gates 1-8 PASS, 1 split candidate pending
</commit_message>
<xml_diff>
--- a/gdocs_build/Hebrews.docx
+++ b/gdocs_build/Hebrews.docx
@@ -20,7 +20,7 @@
         <w:pStyle w:val="Heading1"/>
       </w:pPr>
       <w:r>
-        <w:t>Chapter 1 — God's Son is the Ultimate honored</w:t>
+        <w:t>Chapter 1 — God's Son Is the Ultimate Honored One</w:t>
       </w:r>
     </w:p>
     <w:tbl>
@@ -933,7 +933,7 @@
               <w:rPr>
                 <w:sz w:val="18"/>
               </w:rPr>
-              <w:t>Now, God didn't put angels in charge of the world to come, the one we're talking about. Someone in the Scriptures even asked, "Who are we that you even care about us? Why do you give us a second thought?" You made us a little lower than the angels, bright with Eden's dawn light, and you put us in charge of everything you made. But let's be real, we don't see ourselves running the whole show just yet. What we do see is Jesus. He was made a little lower than the angels for a bit, but after he faced death, he got the ultimate promotion. He's now crowned with glory "bright with Eden's dawn light," higher than any angel. He basically took one for the team and died for every single one of us.</w:t>
+              <w:t>Now, God didn't put angels in charge of the world to come, the one we're talking about. Someone in the Scriptures even asked, "Who are we that you even care about us? Why do you give us a second thought?" You made us a little lower than the angels, bright with Eden's dawn light, and you put us in charge of everything you made — nothing left out. But let's be real, we don't see ourselves running the whole show just yet. What we do see is Jesus. He was made a little lower than the angels for a bit, but after he faced death, he got the ultimate promotion. He's now crowned with glory "bright with Eden's dawn light," higher than any angel. He basically took one for the team and died for every single one of us.</w:t>
             </w:r>
           </w:p>
         </w:tc>
@@ -1315,7 +1315,7 @@
                 <w:b/>
                 <w:sz w:val="18"/>
               </w:rPr>
-              <w:t>The Centerpiece of Everything We Believe</w:t>
+              <w:t>The Centerpiece of All We Believe</w:t>
             </w:r>
           </w:p>
         </w:tc>
@@ -1753,7 +1753,7 @@
                 <w:b/>
                 <w:sz w:val="18"/>
               </w:rPr>
-              <w:t>When Promises Are Mixed with Faith</w:t>
+              <w:t>When the Promises Are Mixed with Faith</w:t>
             </w:r>
           </w:p>
         </w:tc>
@@ -2882,7 +2882,7 @@
               <w:rPr>
                 <w:sz w:val="18"/>
               </w:rPr>
-              <w:t>It's like a field that gets plenty of rain. If it grows a bunch of awesome crops, the gardener is stoked. But if it just pops up a bunch of weeds, it's getting torched. No harvest, just a big ol' bonfire. You don't want to be that field.</w:t>
+              <w:t>It's like a field that gets plenty of rain. If it grows carrots and corn, God gives it a 'Well done!' But if it just pops up a bunch of weeds and thistles, it's more likely to get cussed out. Fields like that get burned, not harvested. You don't want to be that field.</w:t>
             </w:r>
           </w:p>
         </w:tc>
@@ -2953,7 +2953,7 @@
               <w:rPr>
                 <w:sz w:val="18"/>
               </w:rPr>
-              <w:t>But yo, I know you guys aren't like that. I've seen how you've shown love to God by helping out other Christians. That's legit. God sees that. So keep that same energy. Go all in on the hope you have, and don't get lazy. Be like the legends who kept the faith and got everything God promised them.</w:t>
+              <w:t>But yo, I know you guys aren't like that. I've got better things in mind for you — salvation things! I've seen how you've shown love to God by helping out other Christians, and that you keep at it. That's legit. God sees that. So keep that same energy. Go all in on the full-bodied hope you have, and keep at it till the finish — don't get lazy. Be like the legends who kept the faith and got everything God promised them.</w:t>
             </w:r>
           </w:p>
         </w:tc>
@@ -3158,7 +3158,7 @@
               <w:rPr>
                 <w:sz w:val="18"/>
               </w:rPr>
-              <w:t>So for us, who are running to God for safety, we can grab onto that hope and never let go. It's like a spiritual lifeline that goes right into the very presence of God, where Jesus, running on ahead of us, has taken up his permanent post as our High Priest, in the order of Melchizedek. He's the ultimate wingman.</w:t>
+              <w:t>So for us, who are running for our very lives to God, we have every reason to grab onto that promised hope with both hands and never let go. It's an unbreakable spiritual lifeline, reaching past all appearances right into the very presence of God, where Jesus, running on ahead of us, has taken up his permanent post as our High Priest, in the order of Melchizedek. He's the ultimate wingman.</w:t>
             </w:r>
           </w:p>
         </w:tc>
@@ -3430,7 +3430,7 @@
               <w:rPr>
                 <w:sz w:val="18"/>
               </w:rPr>
-              <w:t>You can tell Melchizedek was a big deal because even Father Abraham, the guy who started it all, gave him a ten percent cut of his winnings. Think about it: the priests from Levi's tribe, who are all related to Abraham, have a rule to collect a tenth from their own people. But this Melchizedek guy, a total outsider, collects it from Abraham and even blesses him — the guy who got all the promises from God! And everyone knows, when someone gives a blessing, the one giving it is the greater one.</w:t>
+              <w:t>You can tell Melchizedek was a big deal because even Father Abraham, the guy who started it all, gave him a ten percent cut of his winnings. Think about it: the priests from Levi's tribe, who are more or less equals with the people — priests and people, all related to Abraham — have a rule to collect a tenth from their own people. But this Melchizedek guy, a total outsider, collects it from Abraham and even blesses him — the guy who got all the promises from God! And everyone knows, when someone gives a blessing, the one giving it is the greater one.</w:t>
             </w:r>
           </w:p>
         </w:tc>
@@ -3501,7 +3501,7 @@
               <w:rPr>
                 <w:sz w:val="18"/>
               </w:rPr>
-              <w:t>Here's another way to look at it: we give our money to priests who eventually die. But Abraham gave his to a priest who the Bible says 'lives.' You could even say that Levi, the ancestor of all the priests, basically paid his dues to Melchizedek through Abraham. It's like Melchizedek got the credit in the end.</w:t>
+              <w:t>Here's another way to look at it: we give our money to priests who eventually die. But Abraham gave his to a priest who the Bible says 'lives.' You could even say that Levi, the ancestor of all the priests, basically paid his dues to Melchizedek through Abraham — since Levi descended from Abraham, who paid tithes to Melchizedek, when we pay our tithes to the priestly tribe of Levi, they end up with Melchizedek. It's like Melchizedek got the credit in the end.</w:t>
             </w:r>
           </w:p>
         </w:tc>
@@ -4294,7 +4294,7 @@
               <w:rPr>
                 <w:sz w:val="18"/>
               </w:rPr>
-              <w:t>But Jesus's job as a priest is way better than theirs because he's working with a much better plan. If the first plan, the old agreement, had been perfect, we wouldn't have needed a new one. But it had some problems. God said, "Listen up! The time is coming when I'm going to make a new plan with my people. I'm getting rid of the old plan I made with their ancestors when I led them out of Egypt. They didn't stick to their part of the deal, so I had to let them go. This new plan I'm making isn't going to be written on paper or carved in stone. This time, I'm writing it directly in their hearts. I'll be their God, and they'll be my people. They won't have to go to school to learn about me or read a book to get it. Everyone will know me, from the least to the greatest. They'll know me because I'll forgive them, and I'll completely wipe their sins away."</w:t>
+              <w:t>But Jesus's job as a priest is way better than theirs because he's working with a much better plan. If the first plan, the old agreement, had been perfect, we wouldn't have needed a new one. But it had some problems. God said, "Listen up! The time is coming when I'm going to set up a new plan for dealing with Israel and Judah. I'm getting rid of the old plan I made with their ancestors when I led them by the hand out of Egypt. They didn't stick to their part of the deal, so I had to let them go. This new plan I'm making with Israel isn't going to be written on paper or carved in stone. This time, I'm writing it directly in their hearts. I'll be their God, and they'll be my people. They won't have to go to school to learn about me or buy a book called *God in Five Easy Lessons*. Everyone will know me, from the least to the greatest. They'll know me because I'll forgive them, and I'll completely wipe their sins away."</w:t>
             </w:r>
           </w:p>
         </w:tc>
@@ -4566,7 +4566,7 @@
               <w:rPr>
                 <w:sz w:val="18"/>
               </w:rPr>
-              <w:t>Alright, so check it. The first deal God had with his people had a whole bunch of rules for how to worship and a special place to do it. They set up this big tent, and in the main room, they had a lamp, a table, and some special bread. They called it the "Holy Place." But then there was another, even more exclusive room behind a curtain, called the "Holy of Holies." Inside, they had a gold altar for incense, and the Ark of the Covenant, which was covered in gold and held some crazy important stuff: a gold jar of manna (that magic bread from the desert), Aaron's staff that grew leaves, and the stone tablets with the Ten Commandments. And on top of the Ark were these awesome angel-wing statues. But we don't have time to get into all of that right now.</w:t>
+              <w:t>Alright, so check it. The first deal God had with his people had a whole bunch of rules for how to worship and a special place to do it. They set up this big tent, and in the main room, they had a lampstand, a table, and "the bread of presence." They called it the "Holy Place." But then there was another, even more exclusive room behind a curtain, called the "Holy of Holies." Inside, they had a gold altar for incense, and the Ark of the Covenant, which was covered in gold and held some crazy important stuff: a gold jar of manna (that magic bread from the desert), Aaron's staff that grew leaves, and the stone tablets with the Ten Commandments. And on top of the Ark was the angel-wing-shadowed mercy seat. But we don't have time to get into all of that right now.</w:t>
             </w:r>
           </w:p>
         </w:tc>
@@ -5272,7 +5272,7 @@
               <w:rPr>
                 <w:sz w:val="18"/>
               </w:rPr>
-              <w:t>Alright, so check it. The old way of doing things, with all the rules and sacrifices? That was just a sneak peek, like a movie trailer for the awesome new plan. That old system was incomplete, a beta version, so it could never truly fix people. No matter how many animals they sacrificed, year after year, it was like trying to fill a bucket with a hole in it. It just reminded them of their mess-ups and made them feel even guiltier. Let's be real, the blood of bulls and goats can't just delete sin. It's like trying to erase a permanent marker with a pencil eraser. Pointless.</w:t>
+              <w:t>Alright, so check it. The old way of doing things, with all the rules and sacrifices? That was just a sneak peek, like a movie trailer for the awesome new plan. That old system was incomplete, a beta version, so it could never truly fix people. No matter how many animals they sacrificed, year after year, it was like trying to fill a bucket with a hole in it. If those sacrifices had actually worked, the worshipers would have gone blissfully on their way, no longer dragged down by their sins. But it just reminded them of their mess-ups and made them feel even guiltier. Let's be real, the blood of bulls and goats can't just delete sin. It's like trying to erase a permanent marker with a pencil eraser. Pointless.</w:t>
             </w:r>
           </w:p>
         </w:tc>
@@ -5343,7 +5343,7 @@
               <w:rPr>
                 <w:sz w:val="18"/>
               </w:rPr>
-              <w:t>This is what the prophecy was talking about, with Jesus saying: "You don't want all these endless sacrifices. You gave me a body to be the real sacrifice. You're not impressed by the smoke and smells from the altar. So I said, 'I'm here to do it your way, God, just like it says in your book.'"</w:t>
+              <w:t>This is what the prophecy was talking about, with Jesus saying: "You don't want sacrifices and offerings, year after year. You gave me a body to be the real sacrifice. You're not impressed by the smoke and smells from the altar. So I said, 'I'm here to do it your way, God, just like it says in your book.'"</w:t>
             </w:r>
           </w:p>
         </w:tc>
@@ -5588,7 +5588,7 @@
               <w:rPr>
                 <w:sz w:val="18"/>
               </w:rPr>
-              <w:t>The Holy Spirit even confirms this, saying the new deal God is making with us won't be written on paper or carved in stone. This time, God's writing his plan *inside* us, on our hearts. And then He says, "I'll completely forget their sins." Once our sins are gone for good, there's no need for any more sacrifices. Mic drop.</w:t>
+              <w:t>The Holy Spirit even confirms this, saying the new deal God is making with Israel won't be written on paper or carved in stone. This time, God's writing his plan *inside* us, on our hearts. And then He says, "I'll completely forget their sins." Once our sins are gone for good, there's no need for any more sacrifices. Mic drop.</w:t>
             </w:r>
           </w:p>
         </w:tc>
@@ -5722,7 +5722,7 @@
               <w:rPr>
                 <w:sz w:val="18"/>
               </w:rPr>
-              <w:t>So, my guys, because of Jesus' sacrifice, we can walk right up to God, into the Holy Place, with no hesitation. Jesus cleared the way for us. The curtain that used to block us from God's presence? That's Jesus' body.</w:t>
+              <w:t>So, my guys, because of Jesus' sacrifice, we can walk right up to God, into the Holy Place, with no hesitation. Jesus has cleared the way by the blood of his sacrifice, acting as our priest before God. The curtain that used to block us from God's presence? That's Jesus' body.</w:t>
             </w:r>
           </w:p>
         </w:tc>
@@ -5864,7 +5864,7 @@
               <w:rPr>
                 <w:sz w:val="18"/>
               </w:rPr>
-              <w:t>If we bail on everything we've learned and been given, if we turn our backs on the truth, we're basically spitting on Jesus' sacrifice. Then we're on our own, and we'll have to face God's judgment, which is going to be intense. If breaking the old rules meant you could be put to death, what do you think will happen if you diss God's Son, disrespect the sacrifice that made you whole, and insult the Holy Spirit? This is not a small thing. God said He'll get his vengeance and that He'll judge his people. Nobody's getting away with anything.</w:t>
+              <w:t>If we bail on everything we've learned and been given, if we turn our backs on the truth, we're basically spitting on Jesus' sacrifice. Then we're on our own, and we'll have to face God's judgment, which is going to be intense. If breaking the old rules meant you could be put to death, what do you think will happen if you diss God's Son, disrespect the sacrifice that made you whole, and insult the Holy Spirit? This is not a small thing. God was quite explicit: "Vengeance is mine, and I won't overlook a thing" and "God will judge his people." Nobody's getting by with anything, believe me.</w:t>
             </w:r>
           </w:p>
         </w:tc>
@@ -9157,7 +9157,7 @@
               <w:rPr>
                 <w:sz w:val="18"/>
               </w:rPr>
-              <w:t>모든 것을 하나로 모으시고 온전하게 하시는 하나님, 예수님의 희생을 통해 영원한 흔적을 남기시고, 그 피의 희생으로 영원한 언약을 맺으시고, 우리의 위대한 목자 예수님을 죽은 자들 가운데서 살려내신 평화의 하나님! 이제 그분이 너희를 하나로 세우시고, 그분을 기쁘시게 하는 데 필요한 모든 것을 주시기를. 예수 그리스도, 곧 메시아의 희생을 통해서, 하나님 보시기에 가장 기쁜 모습으로 우리를 만들어주시기를 기도할게. 영광이 예수님께 영원히! 아멘, 아멘!</w:t>
+              <w:t>모든 것을 하나로 모으시고 온전하게 하시는 하나님, 예수님의 희생을 통해 영원한 흔적을 남기시고, 그 피의 희생으로 영원한 언약을 맺으시고, 우리의 위대한 목자 예수님을 죽은 자들 가운데서 살려내신 하나님! 이제 그분이 너희를 하나로 세우시고, 그분을 기쁘시게 하는 데 필요한 모든 것을 주시기를. 예수 그리스도, 곧 메시아의 희생을 통해서, 하나님 보시기에 가장 기쁜 모습으로 우리를 만들어주시기를 기도할게. 영광이 예수님께 영원히! 아멘, 아멘!</w:t>
             </w:r>
           </w:p>
         </w:tc>

</xml_diff>

<commit_message>
2nd-pass NT review: Hebrews 11:1-2 restore 'trust in God' (EN+KO)
- 2nd review vs MSG: Hebrews 11:1-2 EN dropped the object of faith
  ('this trust in God') - generic 'being 100% sure' without naming God.
  Restored 'It's this trust in God' in teen voice; KO 1:1 parity.
- Re-checked 4 other candidates against MSG text and voided them:
  11:11-12 (MSG attributes Sarah's faith), 12:24 (Abel contrast matches),
  13:7-8 (consistency sentence matches), 9:24 (offered himself matches).
- Google Doc reuploaded: API 13/13, export-back VERIFIED OK.
- Production app untouched.
</commit_message>
<xml_diff>
--- a/gdocs_build/Hebrews.docx
+++ b/gdocs_build/Hebrews.docx
@@ -5953,7 +5953,7 @@
               <w:rPr>
                 <w:sz w:val="18"/>
               </w:rPr>
-              <w:t>So, what's the deal with faith? It's basically being 100% sure about stuff you can't even see. It's the solid ground under everything that makes life awesome. This is what made our ancestors total legends.</w:t>
+              <w:t>So, what's the deal with faith? It's this trust in God — being 100% sure about stuff you can't even see. It's the solid ground under everything that makes life awesome. This is what made our ancestors total legends.</w:t>
             </w:r>
           </w:p>
         </w:tc>
@@ -5976,7 +5976,7 @@
               <w:rPr>
                 <w:sz w:val="18"/>
               </w:rPr>
-              <w:t>그래서 믿음이 뭐냐고? 한마디로, 눈에도 안 보이는 걸 100% 확신하는 거임. 믿음은 인생을 가치 있게 만드는 모든 것들의 든든한 기반이야. 우리 조상들이 다른 사람들이랑 완전 클라스가 달랐던 게 바로 이 믿음 때문이었음.</w:t>
+              <w:t>그래서 믿음이 뭐냐고? 한마디로, 하나님을 신뢰하면서 눈에도 안 보이는 걸 100% 확신하는 거임. 믿음은 인생을 가치 있게 만드는 모든 것들의 든든한 기반이야. 우리 조상들이 다른 사람들이랑 완전 클라스가 달랐던 게 바로 이 믿음 때문이었음.</w:t>
             </w:r>
           </w:p>
         </w:tc>

</xml_diff>